<commit_message>
Nuevos cambios a pagos
</commit_message>
<xml_diff>
--- a/Herramientas/Documentación Proyecto Final - Galería Comercial.docx
+++ b/Herramientas/Documentación Proyecto Final - Galería Comercial.docx
@@ -4345,6 +4345,9 @@
                                   </w:rPr>
                                 </w:pPr>
                                 <w:r>
+                                  <w:t xml:space="preserve">Navarro, </w:t>
+                                </w:r>
+                                <w:r>
                                   <w:t>Fabricio</w:t>
                                 </w:r>
                               </w:p>
@@ -4361,21 +4364,8 @@
                                   </w:rPr>
                                 </w:pPr>
                                 <w:r>
-                                  <w:t>Mario</w:t>
+                                  <w:t xml:space="preserve">Díaz, Víctor </w:t>
                                 </w:r>
-                              </w:p>
-                              <w:p>
-                                <w:pPr>
-                                  <w:pStyle w:val="Prrafodelista"/>
-                                  <w:numPr>
-                                    <w:ilvl w:val="0"/>
-                                    <w:numId w:val="3"/>
-                                  </w:numPr>
-                                  <w:rPr>
-                                    <w:b/>
-                                    <w:bCs/>
-                                  </w:rPr>
-                                </w:pPr>
                                 <w:r>
                                   <w:t>Damián</w:t>
                                 </w:r>
@@ -4535,6 +4525,9 @@
                             </w:rPr>
                           </w:pPr>
                           <w:r>
+                            <w:t xml:space="preserve">Navarro, </w:t>
+                          </w:r>
+                          <w:r>
                             <w:t>Fabricio</w:t>
                           </w:r>
                         </w:p>
@@ -4551,21 +4544,8 @@
                             </w:rPr>
                           </w:pPr>
                           <w:r>
-                            <w:t>Mario</w:t>
+                            <w:t xml:space="preserve">Díaz, Víctor </w:t>
                           </w:r>
-                        </w:p>
-                        <w:p>
-                          <w:pPr>
-                            <w:pStyle w:val="Prrafodelista"/>
-                            <w:numPr>
-                              <w:ilvl w:val="0"/>
-                              <w:numId w:val="3"/>
-                            </w:numPr>
-                            <w:rPr>
-                              <w:b/>
-                              <w:bCs/>
-                            </w:rPr>
-                          </w:pPr>
                           <w:r>
                             <w:t>Damián</w:t>
                           </w:r>

</xml_diff>